<commit_message>
Publish Transactions benchmark results
</commit_message>
<xml_diff>
--- a/compute-bazaar-bench/evals/transactions/draft-capacity-data-room-population-plan/solution/capacity-data-room-population-plan.docx
+++ b/compute-bazaar-bench/evals/transactions/draft-capacity-data-room-population-plan/solution/capacity-data-room-population-plan.docx
@@ -1191,7 +1191,7 @@
               <w:rPr>
                 <w:sz w:val="15"/>
               </w:rPr>
-              <w:t>Formation, good standing, ownership and beneficial owners</w:t>
+              <w:t>Formation, good standing, ownership, beneficial owners, and KYC materials</w:t>
             </w:r>
           </w:p>
         </w:tc>
@@ -1722,7 +1722,7 @@
               <w:rPr>
                 <w:sz w:val="15"/>
               </w:rPr>
-              <w:t>Partial - easement update missing</w:t>
+              <w:t>Collect current title, survey, easement, and amendment set</w:t>
             </w:r>
           </w:p>
         </w:tc>
@@ -1871,7 +1871,7 @@
               <w:rPr>
                 <w:sz w:val="15"/>
               </w:rPr>
-              <w:t>Permit matrix in review</w:t>
+              <w:t>Collect requested permits; current status is not evidenced</w:t>
             </w:r>
           </w:p>
         </w:tc>
@@ -2598,7 +2598,7 @@
               <w:rPr>
                 <w:sz w:val="15"/>
               </w:rPr>
-              <w:t>Current as of Aug. 9</w:t>
+              <w:t>Collect current design set, construction schedule, and punch list</w:t>
             </w:r>
           </w:p>
         </w:tc>
@@ -3382,7 +3382,7 @@
               <w:rPr>
                 <w:sz w:val="15"/>
               </w:rPr>
-              <w:t>Network topology, port map and oversubscription</w:t>
+              <w:t>Network topology, port map, oversubscription, external capacity and redundancy</w:t>
             </w:r>
           </w:p>
         </w:tc>
@@ -3674,7 +3674,7 @@
               <w:rPr>
                 <w:sz w:val="15"/>
               </w:rPr>
-              <w:t>Cooling design basis and capacity model</w:t>
+              <w:t>Cooling design, capacity, water/coolant dependencies and operating limits</w:t>
             </w:r>
           </w:p>
         </w:tc>
@@ -4550,7 +4550,7 @@
               <w:rPr>
                 <w:sz w:val="15"/>
               </w:rPr>
-              <w:t>Staffing, monitoring and maintenance</w:t>
+              <w:t>Operating procedures, staffing, monitoring and maintenance</w:t>
             </w:r>
           </w:p>
         </w:tc>
@@ -4642,7 +4642,7 @@
               <w:rPr>
                 <w:sz w:val="15"/>
               </w:rPr>
-              <w:t>Staffing plan draft</w:t>
+              <w:t>Collect operating procedures, staffing, monitoring, and maintenance policy</w:t>
             </w:r>
           </w:p>
         </w:tc>
@@ -4842,7 +4842,7 @@
               <w:rPr>
                 <w:sz w:val="15"/>
               </w:rPr>
-              <w:t>Acceptance and benchmark plan</w:t>
+              <w:t>Proposed service levels, acceptance, and benchmark plan</w:t>
             </w:r>
           </w:p>
         </w:tc>
@@ -4934,7 +4934,7 @@
               <w:rPr>
                 <w:sz w:val="15"/>
               </w:rPr>
-              <w:t>NCCL reference threshold open</w:t>
+              <w:t>Collect proposed service levels and acceptance criteria</w:t>
             </w:r>
           </w:p>
         </w:tc>
@@ -5226,7 +5226,7 @@
               <w:rPr>
                 <w:sz w:val="15"/>
               </w:rPr>
-              <w:t>Current drafts ready</w:t>
+              <w:t>Term sheet logged; collect offer, price build, and draft capacity agreement</w:t>
             </w:r>
           </w:p>
         </w:tc>
@@ -5571,7 +5571,7 @@
               <w:rPr>
                 <w:sz w:val="15"/>
               </w:rPr>
-              <w:t>Funding plan and liquidity</w:t>
+              <w:t>Funding plan, liquidity, and proposed parent-guarantee credit support</w:t>
             </w:r>
           </w:p>
         </w:tc>
@@ -5667,7 +5667,7 @@
               <w:rPr>
                 <w:sz w:val="15"/>
               </w:rPr>
-              <w:t>Update after lender consent</w:t>
+              <w:t>Collect proposed parent guarantee; update after lender consent</w:t>
             </w:r>
           </w:p>
         </w:tc>
@@ -5863,7 +5863,7 @@
               <w:rPr>
                 <w:sz w:val="15"/>
               </w:rPr>
-              <w:t>Claims, compliance and regulatory materials</w:t>
+              <w:t>Litigation, claims, regulatory correspondence, sanctions, export controls, environmental matters and compliance</w:t>
             </w:r>
           </w:p>
         </w:tc>
@@ -8203,7 +8203,7 @@
     </w:p>
     <w:p>
       <w:r>
-        <w:t>Every upload must carry a document date, version or execution status, relevant entity, DDRL mapping, owner, sensitivity label, and review status. Missing, stale, or partially responsive evidence remains open with an owner and next action. No team member should infer that a requested document exists merely because it appears in this plan.</w:t>
+        <w:t>Record each upload's date, version or execution status, entity, DDRL mapping, owner, sensitivity, review status, and every redaction and basis. Keep missing, stale, or partial evidence open with an owner and next action. A plan entry never proves that a document exists.</w:t>
       </w:r>
     </w:p>
     <w:sectPr>

</xml_diff>